<commit_message>
Trinity tagging v2: 63-topic taxonomy + canonical slug map + re-pilot results
- Add 3 topics from v1 pilot: the-gospel, salvation, integrity-truthfulness-and-speech
- Build tagging-batch-prompt.md with embedded canonical slug map + disambig cheats
- Re-pilot: 10/10 tagged with canonical slugs, all in 3-7 range
- New-topic usage: salvation 4/10, the-gospel 5/10, integrity-truthfulness-and-speech 2/10
- taxonomy doc updated with 2026-06-28 revisions section
</commit_message>
<xml_diff>
--- a/projects/trinity-fellowship/topics-proposed-2026-06-28.docx
+++ b/projects/trinity-fellowship/topics-proposed-2026-06-28.docx
@@ -7,7 +7,7 @@
         <w:pStyle w:val="Title"/>
       </w:pPr>
       <w:r>
-        <w:t xml:space="preserve">Trinity Fellowship Sermon Topic Taxonomy — Proposed (2026-06-28)</w:t>
+        <w:t xml:space="preserve">Trinity Fellowship Sermon Topic Taxonomy — Proposed</w:t>
       </w:r>
     </w:p>
     <w:p>
@@ -26,33 +26,7 @@
         <w:t xml:space="preserve">2026-06-28</w:t>
       </w:r>
     </w:p>
-    <w:sdt>
-      <w:sdtPr>
-        <w:docPartObj>
-          <w:docPartGallery w:val="Table of Contents"/>
-          <w:docPartUnique/>
-        </w:docPartObj>
-      </w:sdtPr>
-      <w:sdtContent>
-        <w:p>
-          <w:pPr>
-            <w:pStyle w:val="TOCHeading"/>
-          </w:pPr>
-          <w:r>
-            <w:t xml:space="preserve">Table of Contents</w:t>
-          </w:r>
-        </w:p>
-        <w:p>
-          <w:r>
-            <w:fldChar w:fldCharType="begin" w:dirty="true"/>
-            <w:instrText xml:space="preserve">TOC \o "1-2" \h \z \u</w:instrText>
-            <w:fldChar w:fldCharType="separate"/>
-            <w:fldChar w:fldCharType="end"/>
-          </w:r>
-        </w:p>
-      </w:sdtContent>
-    </w:sdt>
-    <w:bookmarkStart w:id="21" w:name="X3755a665eb6f43917ab417abf0e55fa934f0c61"/>
+    <w:bookmarkStart w:id="23" w:name="X3755a665eb6f43917ab417abf0e55fa934f0c61"/>
     <w:p>
       <w:pPr>
         <w:pStyle w:val="Heading1"/>
@@ -360,6 +334,122 @@
           <w:b/>
           <w:bCs/>
         </w:rPr>
+        <w:t xml:space="preserve">The Gospel</w:t>
+      </w:r>
+      <w:r>
+        <w:t xml:space="preserve"> </w:t>
+      </w:r>
+      <w:r>
+        <w:t xml:space="preserve">— The whole story of God’s saving work in Christ — what it is, why it matters, how it applies. A meta-topic that runs through most sermons; use when the sermon names or explains</w:t>
+      </w:r>
+      <w:r>
+        <w:t xml:space="preserve"> </w:t>
+      </w:r>
+      <w:r>
+        <w:t xml:space="preserve">“the gospel”</w:t>
+      </w:r>
+      <w:r>
+        <w:t xml:space="preserve"> </w:t>
+      </w:r>
+      <w:r>
+        <w:t xml:space="preserve">itself rather than a specific element (use</w:t>
+      </w:r>
+      <w:r>
+        <w:t xml:space="preserve"> </w:t>
+      </w:r>
+      <w:r>
+        <w:rPr>
+          <w:rStyle w:val="VerbatimChar"/>
+        </w:rPr>
+        <w:t xml:space="preserve">justification</w:t>
+      </w:r>
+      <w:r>
+        <w:t xml:space="preserve"> </w:t>
+      </w:r>
+      <w:r>
+        <w:t xml:space="preserve">for imputed righteousness,</w:t>
+      </w:r>
+      <w:r>
+        <w:t xml:space="preserve"> </w:t>
+      </w:r>
+      <w:r>
+        <w:rPr>
+          <w:rStyle w:val="VerbatimChar"/>
+        </w:rPr>
+        <w:t xml:space="preserve">sanctification</w:t>
+      </w:r>
+      <w:r>
+        <w:t xml:space="preserve"> </w:t>
+      </w:r>
+      <w:r>
+        <w:t xml:space="preserve">for progressive growth,</w:t>
+      </w:r>
+      <w:r>
+        <w:t xml:space="preserve"> </w:t>
+      </w:r>
+      <w:r>
+        <w:rPr>
+          <w:rStyle w:val="VerbatimChar"/>
+        </w:rPr>
+        <w:t xml:space="preserve">repentance-and-saving-faith</w:t>
+      </w:r>
+      <w:r>
+        <w:t xml:space="preserve"> </w:t>
+      </w:r>
+      <w:r>
+        <w:t xml:space="preserve">for the human response, etc.).</w:t>
+      </w:r>
+    </w:p>
+    <w:p>
+      <w:pPr>
+        <w:pStyle w:val="Compact"/>
+        <w:numPr>
+          <w:ilvl w:val="0"/>
+          <w:numId w:val="1002"/>
+        </w:numPr>
+      </w:pPr>
+      <w:r>
+        <w:rPr>
+          <w:b/>
+          <w:bCs/>
+        </w:rPr>
+        <w:t xml:space="preserve">Salvation</w:t>
+      </w:r>
+      <w:r>
+        <w:t xml:space="preserve"> </w:t>
+      </w:r>
+      <w:r>
+        <w:t xml:space="preserve">— The full scope of God’s saving work in a person’s life: from election through glorification. Broader than</w:t>
+      </w:r>
+      <w:r>
+        <w:t xml:space="preserve"> </w:t>
+      </w:r>
+      <w:r>
+        <w:rPr>
+          <w:rStyle w:val="VerbatimChar"/>
+        </w:rPr>
+        <w:t xml:space="preserve">repentance-and-saving-faith</w:t>
+      </w:r>
+      <w:r>
+        <w:t xml:space="preserve"> </w:t>
+      </w:r>
+      <w:r>
+        <w:t xml:space="preserve">(which is the human response) — use when a sermon surveys the whole arc or names salvation as a unified theme rather than any single piece.</w:t>
+      </w:r>
+    </w:p>
+    <w:p>
+      <w:pPr>
+        <w:pStyle w:val="Compact"/>
+        <w:numPr>
+          <w:ilvl w:val="0"/>
+          <w:numId w:val="1002"/>
+        </w:numPr>
+      </w:pPr>
+      <w:r>
+        <w:rPr>
+          <w:b/>
+          <w:bCs/>
+        </w:rPr>
         <w:t xml:space="preserve">The Covenant of Grace</w:t>
       </w:r>
       <w:r>
@@ -1062,7 +1152,59 @@
         <w:t xml:space="preserve"> </w:t>
       </w:r>
       <w:r>
-        <w:t xml:space="preserve">— Sources of temptation; mortification; the believer’s fight against remaining sin.</w:t>
+        <w:t xml:space="preserve">— Sources of temptation; mortification; the believer’s fight against remaining sin. When a sermon is about original sin / the doctrine of humanity’s fallen nature rather than personal temptation, also pull in</w:t>
+      </w:r>
+      <w:r>
+        <w:t xml:space="preserve"> </w:t>
+      </w:r>
+      <w:r>
+        <w:rPr>
+          <w:rStyle w:val="VerbatimChar"/>
+        </w:rPr>
+        <w:t xml:space="preserve">sanctification</w:t>
+      </w:r>
+      <w:r>
+        <w:t xml:space="preserve"> </w:t>
+      </w:r>
+      <w:r>
+        <w:t xml:space="preserve">for the contrast God is drawing.</w:t>
+      </w:r>
+    </w:p>
+    <w:p>
+      <w:pPr>
+        <w:pStyle w:val="Compact"/>
+        <w:numPr>
+          <w:ilvl w:val="0"/>
+          <w:numId w:val="1004"/>
+        </w:numPr>
+      </w:pPr>
+      <w:r>
+        <w:rPr>
+          <w:b/>
+          <w:bCs/>
+        </w:rPr>
+        <w:t xml:space="preserve">Integrity, Truthfulness &amp; Speech</w:t>
+      </w:r>
+      <w:r>
+        <w:t xml:space="preserve"> </w:t>
+      </w:r>
+      <w:r>
+        <w:t xml:space="preserve">— Honesty, faithfulness, the danger of falsehood, the power of the tongue; includes themes from Psalm 15 and similar passages that don’t fit cleanly into sanctification/good-works. Distinct from</w:t>
+      </w:r>
+      <w:r>
+        <w:t xml:space="preserve"> </w:t>
+      </w:r>
+      <w:r>
+        <w:rPr>
+          <w:rStyle w:val="VerbatimChar"/>
+        </w:rPr>
+        <w:t xml:space="preserve">anger-forgiveness-and-reconciliation</w:t>
+      </w:r>
+      <w:r>
+        <w:t xml:space="preserve"> </w:t>
+      </w:r>
+      <w:r>
+        <w:t xml:space="preserve">(which is about restoring relationship after being wronged).</w:t>
       </w:r>
     </w:p>
     <w:p>
@@ -1917,7 +2059,250 @@
       </w:r>
     </w:p>
     <w:bookmarkEnd w:id="20"/>
+    <w:bookmarkStart w:id="21" w:name="updated-2026-06-28-after-pilot"/>
+    <w:p>
+      <w:pPr>
+        <w:pStyle w:val="Heading2"/>
+      </w:pPr>
+      <w:r>
+        <w:t xml:space="preserve">Updated 2026-06-28 (after pilot)</w:t>
+      </w:r>
+    </w:p>
+    <w:p>
+      <w:pPr>
+        <w:pStyle w:val="FirstParagraph"/>
+      </w:pPr>
+      <w:r>
+        <w:t xml:space="preserve">After tagging the first 10 sermons, three additions were made:</w:t>
+      </w:r>
+    </w:p>
+    <w:p>
+      <w:pPr>
+        <w:pStyle w:val="Compact"/>
+        <w:numPr>
+          <w:ilvl w:val="0"/>
+          <w:numId w:val="1009"/>
+        </w:numPr>
+      </w:pPr>
+      <w:r>
+        <w:rPr>
+          <w:rStyle w:val="VerbatimChar"/>
+          <w:b/>
+          <w:bCs/>
+        </w:rPr>
+        <w:t xml:space="preserve">gospel</w:t>
+      </w:r>
+      <w:r>
+        <w:rPr>
+          <w:b/>
+          <w:bCs/>
+        </w:rPr>
+        <w:t xml:space="preserve"> </w:t>
+      </w:r>
+      <w:r>
+        <w:rPr>
+          <w:b/>
+          <w:bCs/>
+        </w:rPr>
+        <w:t xml:space="preserve">and</w:t>
+      </w:r>
+      <w:r>
+        <w:rPr>
+          <w:b/>
+          <w:bCs/>
+        </w:rPr>
+        <w:t xml:space="preserve"> </w:t>
+      </w:r>
+      <w:r>
+        <w:rPr>
+          <w:rStyle w:val="VerbatimChar"/>
+          <w:b/>
+          <w:bCs/>
+        </w:rPr>
+        <w:t xml:space="preserve">salvation</w:t>
+      </w:r>
+      <w:r>
+        <w:rPr>
+          <w:b/>
+          <w:bCs/>
+        </w:rPr>
+        <w:t xml:space="preserve"> </w:t>
+      </w:r>
+      <w:r>
+        <w:rPr>
+          <w:b/>
+          <w:bCs/>
+        </w:rPr>
+        <w:t xml:space="preserve">added as discrete topics in Bucket 2.</w:t>
+      </w:r>
+      <w:r>
+        <w:t xml:space="preserve"> </w:t>
+      </w:r>
+      <w:r>
+        <w:t xml:space="preserve">The pilot showed both are recurring sermon themes that didn’t fit cleanly into existing topics.</w:t>
+      </w:r>
+      <w:r>
+        <w:t xml:space="preserve"> </w:t>
+      </w:r>
+      <w:r>
+        <w:rPr>
+          <w:rStyle w:val="VerbatimChar"/>
+        </w:rPr>
+        <w:t xml:space="preserve">gospel</w:t>
+      </w:r>
+      <w:r>
+        <w:t xml:space="preserve"> </w:t>
+      </w:r>
+      <w:r>
+        <w:t xml:space="preserve">is the meta-topic (what it is, why it matters, how it applies);</w:t>
+      </w:r>
+      <w:r>
+        <w:t xml:space="preserve"> </w:t>
+      </w:r>
+      <w:r>
+        <w:rPr>
+          <w:rStyle w:val="VerbatimChar"/>
+        </w:rPr>
+        <w:t xml:space="preserve">salvation</w:t>
+      </w:r>
+      <w:r>
+        <w:t xml:space="preserve"> </w:t>
+      </w:r>
+      <w:r>
+        <w:t xml:space="preserve">is the full arc of God’s saving work.</w:t>
+      </w:r>
+      <w:r>
+        <w:t xml:space="preserve"> </w:t>
+      </w:r>
+      <w:r>
+        <w:rPr>
+          <w:rStyle w:val="VerbatimChar"/>
+        </w:rPr>
+        <w:t xml:space="preserve">repentance-and-saving-faith</w:t>
+      </w:r>
+      <w:r>
+        <w:t xml:space="preserve"> </w:t>
+      </w:r>
+      <w:r>
+        <w:t xml:space="preserve">and</w:t>
+      </w:r>
+      <w:r>
+        <w:t xml:space="preserve"> </w:t>
+      </w:r>
+      <w:r>
+        <w:rPr>
+          <w:rStyle w:val="VerbatimChar"/>
+        </w:rPr>
+        <w:t xml:space="preserve">justification</w:t>
+      </w:r>
+      <w:r>
+        <w:t xml:space="preserve"> </w:t>
+      </w:r>
+      <w:r>
+        <w:t xml:space="preserve">remain narrower tags for the human response and imputed righteousness respectively.</w:t>
+      </w:r>
+    </w:p>
+    <w:p>
+      <w:pPr>
+        <w:pStyle w:val="Compact"/>
+        <w:numPr>
+          <w:ilvl w:val="0"/>
+          <w:numId w:val="1009"/>
+        </w:numPr>
+      </w:pPr>
+      <w:r>
+        <w:rPr>
+          <w:rStyle w:val="VerbatimChar"/>
+          <w:b/>
+          <w:bCs/>
+        </w:rPr>
+        <w:t xml:space="preserve">integrity-truthfulness-speech</w:t>
+      </w:r>
+      <w:r>
+        <w:rPr>
+          <w:b/>
+          <w:bCs/>
+        </w:rPr>
+        <w:t xml:space="preserve"> </w:t>
+      </w:r>
+      <w:r>
+        <w:rPr>
+          <w:b/>
+          <w:bCs/>
+        </w:rPr>
+        <w:t xml:space="preserve">added to Bucket 4.</w:t>
+      </w:r>
+      <w:r>
+        <w:t xml:space="preserve"> </w:t>
+      </w:r>
+      <w:r>
+        <w:t xml:space="preserve">Psalm 15 and similar passages (honesty, faithfulness, the tongue) didn’t sit cleanly under</w:t>
+      </w:r>
+      <w:r>
+        <w:t xml:space="preserve"> </w:t>
+      </w:r>
+      <w:r>
+        <w:rPr>
+          <w:rStyle w:val="VerbatimChar"/>
+        </w:rPr>
+        <w:t xml:space="preserve">sanctification</w:t>
+      </w:r>
+      <w:r>
+        <w:t xml:space="preserve">/</w:t>
+      </w:r>
+      <w:r>
+        <w:rPr>
+          <w:rStyle w:val="VerbatimChar"/>
+        </w:rPr>
+        <w:t xml:space="preserve">good-works</w:t>
+      </w:r>
+      <w:r>
+        <w:t xml:space="preserve"> </w:t>
+      </w:r>
+      <w:r>
+        <w:t xml:space="preserve">in the pilot.</w:t>
+      </w:r>
+    </w:p>
+    <w:p>
+      <w:pPr>
+        <w:pStyle w:val="FirstParagraph"/>
+      </w:pPr>
+      <w:r>
+        <w:t xml:space="preserve">These bring the doctrinal topic count from 55 to 58.</w:t>
+      </w:r>
+    </w:p>
     <w:bookmarkEnd w:id="21"/>
+    <w:bookmarkStart w:id="22" w:name="topic-slug-map"/>
+    <w:p>
+      <w:pPr>
+        <w:pStyle w:val="Heading2"/>
+      </w:pPr>
+      <w:r>
+        <w:t xml:space="preserve">Topic slug map</w:t>
+      </w:r>
+    </w:p>
+    <w:p>
+      <w:pPr>
+        <w:pStyle w:val="FirstParagraph"/>
+      </w:pPr>
+      <w:r>
+        <w:t xml:space="preserve">For Codex sub-agent tagging, every topic title above maps to a kebab-case slug. The full mapping is in</w:t>
+      </w:r>
+      <w:r>
+        <w:t xml:space="preserve"> </w:t>
+      </w:r>
+      <w:r>
+        <w:rPr>
+          <w:rStyle w:val="VerbatimChar"/>
+        </w:rPr>
+        <w:t xml:space="preserve">topic-slug-map.json</w:t>
+      </w:r>
+      <w:r>
+        <w:t xml:space="preserve">. Include that file in the tagging prompt so Codex uses canonical slugs from the start.</w:t>
+      </w:r>
+    </w:p>
+    <w:bookmarkEnd w:id="22"/>
+    <w:bookmarkEnd w:id="23"/>
     <w:sectPr>
       <w:footnotePr>
         <w:numRestart w:val="eachSect"/>
@@ -2208,6 +2593,91 @@
     </w:lvl>
     <w:lvl w:ilvl="8">
       <w:start w:val="1"/>
+      <w:numFmt w:val="decimal"/>
+      <w:lvlText w:val="%9."/>
+      <w:lvlJc w:val="left"/>
+      <w:pPr>
+        <w:ind w:left="6480" w:hanging="360"/>
+      </w:pPr>
+    </w:lvl>
+  </w:abstractNum>
+  <w:abstractNum w:abstractNumId="99416">
+    <w:nsid w:val="00A99416"/>
+    <w:multiLevelType w:val="multilevel"/>
+    <w:lvl w:ilvl="0">
+      <w:start w:val="6"/>
+      <w:numFmt w:val="decimal"/>
+      <w:lvlText w:val="%1."/>
+      <w:lvlJc w:val="left"/>
+      <w:pPr>
+        <w:ind w:left="720" w:hanging="360"/>
+      </w:pPr>
+    </w:lvl>
+    <w:lvl w:ilvl="1">
+      <w:start w:val="6"/>
+      <w:numFmt w:val="decimal"/>
+      <w:lvlText w:val="%2."/>
+      <w:lvlJc w:val="left"/>
+      <w:pPr>
+        <w:ind w:left="1440" w:hanging="360"/>
+      </w:pPr>
+    </w:lvl>
+    <w:lvl w:ilvl="2">
+      <w:start w:val="6"/>
+      <w:numFmt w:val="decimal"/>
+      <w:lvlText w:val="%3."/>
+      <w:lvlJc w:val="left"/>
+      <w:pPr>
+        <w:ind w:left="2160" w:hanging="360"/>
+      </w:pPr>
+    </w:lvl>
+    <w:lvl w:ilvl="3">
+      <w:start w:val="6"/>
+      <w:numFmt w:val="decimal"/>
+      <w:lvlText w:val="%4."/>
+      <w:lvlJc w:val="left"/>
+      <w:pPr>
+        <w:ind w:left="2880" w:hanging="360"/>
+      </w:pPr>
+    </w:lvl>
+    <w:lvl w:ilvl="4">
+      <w:start w:val="6"/>
+      <w:numFmt w:val="decimal"/>
+      <w:lvlText w:val="%5."/>
+      <w:lvlJc w:val="left"/>
+      <w:pPr>
+        <w:ind w:left="3600" w:hanging="360"/>
+      </w:pPr>
+    </w:lvl>
+    <w:lvl w:ilvl="5">
+      <w:start w:val="6"/>
+      <w:numFmt w:val="decimal"/>
+      <w:lvlText w:val="%6."/>
+      <w:lvlJc w:val="left"/>
+      <w:pPr>
+        <w:ind w:left="4320" w:hanging="360"/>
+      </w:pPr>
+    </w:lvl>
+    <w:lvl w:ilvl="6">
+      <w:start w:val="6"/>
+      <w:numFmt w:val="decimal"/>
+      <w:lvlText w:val="%7."/>
+      <w:lvlJc w:val="left"/>
+      <w:pPr>
+        <w:ind w:left="5040" w:hanging="360"/>
+      </w:pPr>
+    </w:lvl>
+    <w:lvl w:ilvl="7">
+      <w:start w:val="6"/>
+      <w:numFmt w:val="decimal"/>
+      <w:lvlText w:val="%8."/>
+      <w:lvlJc w:val="left"/>
+      <w:pPr>
+        <w:ind w:left="5760" w:hanging="360"/>
+      </w:pPr>
+    </w:lvl>
+    <w:lvl w:ilvl="8">
+      <w:start w:val="6"/>
       <w:numFmt w:val="decimal"/>
       <w:lvlText w:val="%9."/>
       <w:lvlJc w:val="left"/>
@@ -2268,6 +2738,36 @@
     </w:lvlOverride>
     <w:lvlOverride w:ilvl="8">
       <w:startOverride w:val="1"/>
+    </w:lvlOverride>
+  </w:num>
+  <w:num w:numId="1009">
+    <w:abstractNumId w:val="99416"/>
+    <w:lvlOverride w:ilvl="0">
+      <w:startOverride w:val="6"/>
+    </w:lvlOverride>
+    <w:lvlOverride w:ilvl="1">
+      <w:startOverride w:val="6"/>
+    </w:lvlOverride>
+    <w:lvlOverride w:ilvl="2">
+      <w:startOverride w:val="6"/>
+    </w:lvlOverride>
+    <w:lvlOverride w:ilvl="3">
+      <w:startOverride w:val="6"/>
+    </w:lvlOverride>
+    <w:lvlOverride w:ilvl="4">
+      <w:startOverride w:val="6"/>
+    </w:lvlOverride>
+    <w:lvlOverride w:ilvl="5">
+      <w:startOverride w:val="6"/>
+    </w:lvlOverride>
+    <w:lvlOverride w:ilvl="6">
+      <w:startOverride w:val="6"/>
+    </w:lvlOverride>
+    <w:lvlOverride w:ilvl="7">
+      <w:startOverride w:val="6"/>
+    </w:lvlOverride>
+    <w:lvlOverride w:ilvl="8">
+      <w:startOverride w:val="6"/>
     </w:lvlOverride>
   </w:num>
 </w:numbering>

</xml_diff>